<commit_message>
Update jurnal.docx with latest references and fix locks
</commit_message>
<xml_diff>
--- a/jurnal.docx
+++ b/jurnal.docx
@@ -206,7 +206,7 @@
           <w:sz w:val="22"/>
           <w:szCs w:val="22"/>
         </w:rPr>
-        <w:t xml:space="preserve">Keterbukaan informasi publik merupakan pilar utama dalam mewujudkan tata kelola pemerintahan yang bersih dan transparan. Dinas Komunikasi Informatika dan Persandian (Diskominfo) Kabupaten Sinjai mengembangkan website Pejabat Pengelola Informasi dan Dokumentasi (PPID) versi 2 untuk memudahkan penginputan dan publikasi data informasi dari Organisasi Perangkat Daerah (OPD). Penelitian ini bertujuan untuk mengevaluasi </w:t>
+        <w:t xml:space="preserve">Keterbukaan informasi publik merupakan pilar utama dalam mewujudkan tata kelola pemerintahan yang bersih dan transparan. Dinas Komunikasi Informatika dan Persandian (Diskominfo) Kabupaten Sinjai melakukan optimalisasi pada website Pejabat Pengelola Informasi dan Dokumentasi (PPID) sebagai peningkatan dari sistem sebelumnya untuk memudahkan penginputan dan publikasi data informasi dari Organisasi Perangkat Daerah (OPD). Penelitian ini bertujuan untuk mengevaluasi </w:t>
       </w:r>
       <w:r>
         <w:rPr>
@@ -338,7 +338,7 @@
           <w:szCs w:val="22"/>
           <w:i/>
         </w:rPr>
-        <w:t xml:space="preserve">Public information disclosure is a key pillar in achieving clean and transparent governance. The Department of Communication, Informatics, and Media (Diskominfo) of Sinjai Regency developed the PPID (Information and Documentation Management Officer) website version 2 to facilitate the entry and publication of information from regional government agencies (OPD). This study aims to evaluate the usability of the Sinjai Regency PPID website based on the perception of OPD operators/admins. The research method used is descriptive qualitative and quantitative by distributing questionnaires to 28 respondents of assistant PPID admins within the Sinjai Regency government. The results of the data analysis show that, in general, this system has successfully increased reporting productivity (100% of respondents agree) compared to the previous system and is highly helpful in automatic document categorization (100% of respondents agree). However, there are some critical findings related to usability aspects, including the error handling system, which was rated as unclear by 96.43% of respondents, and the visual interface, which still needs improvement (50% rated as average/poor). The main recommendations of this study are the need to optimize the error messaging system, provide a self-monitoring feature for document completeness progress for OPD admins, and develop an offline upload feature to overcome internet connection stability constraints in the region.</w:t>
+        <w:t xml:space="preserve">Public information disclosure is a key pillar in achieving clean and transparent governance. The Department of Communication, Informatics, and Media (Diskominfo) of Sinjai Regency optimized the PPID (Information and Documentation Management Officer) website as an upgrade to the previous system to facilitate the entry and publication of information from regional government agencies (OPD). This study aims to evaluate the usability of the Sinjai Regency PPID website based on the perception of OPD operators/admins. The research method used is descriptive qualitative and quantitative by distributing questionnaires to 28 respondents of assistant PPID admins within the Sinjai Regency government. The results of the data analysis show that, in general, this system has successfully increased reporting productivity (100% of respondents agree) compared to the previous system and is highly helpful in automatic document categorization (100% of respondents agree). However, there are some critical findings related to usability aspects, including the error handling system, which was rated as unclear by 96.43% of respondents, and the visual interface, which still needs improvement (50% rated as average/poor). The main recommendations of this study are the need to optimize the error messaging system, provide a self-monitoring feature for document completeness progress for OPD admins, and develop an offline upload feature to overcome internet connection stability constraints in the region.</w:t>
       </w:r>
     </w:p>
     <w:p>
@@ -382,7 +382,7 @@
           <w:sz w:val="22"/>
           <w:szCs w:val="22"/>
         </w:rPr>
-        <w:t xml:space="preserve">Untuk mendigitalisasi dan mempercepat alur koordinasi serta publikasi berkas informasi publik, Diskominfo Kabupaten Sinjai mengembangkan aplikasi berbasis web PPID versi 2. Aplikasi ini dirancang agar setiap admin pembantu di masing-masing OPD dapat mengunggah dan mengelola dokumen informasi publik mereka sendiri secara mandiri. Meskipun sistem ini telah diimplementasikan, keberhasilan adopsi teknologi sangat bergantung pada aspek </w:t>
+        <w:t xml:space="preserve">Untuk mendigitalisasi dan mempercepat alur koordinasi serta publikasi berkas informasi publik, Diskominfo Kabupaten Sinjai mengimplementasikan pengembangan dan optimalisasi aplikasi berbasis web PPID sebagai langkah peningkatan layanan dari sistem sebelumnya. Aplikasi ini dirancang agar setiap admin pembantu di masing-masing OPD dapat mengunggah dan mengelola dokumen informasi publik mereka sendiri secara mandiri. Meskipun sistem ini telah diimplementasikan, keberhasilan adopsi teknologi sangat bergantung pada aspek </w:t>
       </w:r>
       <w:r>
         <w:rPr>
@@ -482,16 +482,16 @@
     </w:p>
     <w:p>
       <w:pPr>
-        <w:spacing w:before="120" w:after="120"/>
-        <w:jc w:val="both"/>
-      </w:pPr>
-      <w:r>
-        <w:rPr>
-          <w:rFonts w:ascii="Arial" w:hAnsi="Arial"/>
-          <w:sz w:val="22"/>
-          <w:szCs w:val="22"/>
-        </w:rPr>
-        <w:t xml:space="preserve">1.  </w:t>
+        <w:spacing w:before="60" w:after="60"/>
+        <w:ind w:left="360" w:hanging="180"/>
+      </w:pPr>
+      <w:r>
+        <w:rPr>
+          <w:rFonts w:ascii="Arial" w:hAnsi="Arial"/>
+          <w:b/>
+          <w:sz w:val="22"/>
+        </w:rPr>
+        <w:t>1. </w:t>
       </w:r>
       <w:r>
         <w:rPr>
@@ -581,16 +581,16 @@
     </w:p>
     <w:p>
       <w:pPr>
-        <w:spacing w:before="120" w:after="120"/>
-        <w:jc w:val="both"/>
-      </w:pPr>
-      <w:r>
-        <w:rPr>
-          <w:rFonts w:ascii="Arial" w:hAnsi="Arial"/>
-          <w:sz w:val="22"/>
-          <w:szCs w:val="22"/>
-        </w:rPr>
-        <w:t xml:space="preserve">2.  </w:t>
+        <w:spacing w:before="60" w:after="60"/>
+        <w:ind w:left="360" w:hanging="180"/>
+      </w:pPr>
+      <w:r>
+        <w:rPr>
+          <w:rFonts w:ascii="Arial" w:hAnsi="Arial"/>
+          <w:b/>
+          <w:sz w:val="22"/>
+        </w:rPr>
+        <w:t>2. </w:t>
       </w:r>
       <w:r>
         <w:rPr>
@@ -646,16 +646,16 @@
     </w:p>
     <w:p>
       <w:pPr>
-        <w:spacing w:before="120" w:after="120"/>
-        <w:jc w:val="both"/>
-      </w:pPr>
-      <w:r>
-        <w:rPr>
-          <w:rFonts w:ascii="Arial" w:hAnsi="Arial"/>
-          <w:sz w:val="22"/>
-          <w:szCs w:val="22"/>
-        </w:rPr>
-        <w:t xml:space="preserve">3.  </w:t>
+        <w:spacing w:before="60" w:after="60"/>
+        <w:ind w:left="360" w:hanging="180"/>
+      </w:pPr>
+      <w:r>
+        <w:rPr>
+          <w:rFonts w:ascii="Arial" w:hAnsi="Arial"/>
+          <w:b/>
+          <w:sz w:val="22"/>
+        </w:rPr>
+        <w:t>3. </w:t>
       </w:r>
       <w:r>
         <w:rPr>
@@ -860,71 +860,33 @@
     </w:p>
     <w:p>
       <w:pPr>
-        <w:spacing w:before="120" w:after="120"/>
-        <w:jc w:val="both"/>
-      </w:pPr>
-      <w:r>
-        <w:rPr>
-          <w:rFonts w:ascii="Arial" w:hAnsi="Arial"/>
-          <w:sz w:val="22"/>
-          <w:szCs w:val="22"/>
-        </w:rPr>
-        <w:t xml:space="preserve">1.  </w:t>
-      </w:r>
-      <w:r>
-        <w:rPr>
-          <w:rFonts w:ascii="Arial" w:hAnsi="Arial"/>
-          <w:sz w:val="22"/>
-          <w:szCs w:val="22"/>
-          <w:b/>
-        </w:rPr>
-        <w:t xml:space="preserve">Jabatan/Peran dalam Pengelola PPID</w:t>
-      </w:r>
-      <w:r>
-        <w:rPr>
-          <w:rFonts w:ascii="Arial" w:hAnsi="Arial"/>
-          <w:sz w:val="22"/>
-          <w:szCs w:val="22"/>
-        </w:rPr>
-        <w:t xml:space="preserve">:</w:t>
-      </w:r>
-    </w:p>
-    <w:p>
-      <w:pPr>
         <w:spacing w:before="60" w:after="60"/>
         <w:ind w:left="360" w:hanging="180"/>
       </w:pPr>
       <w:r>
         <w:rPr>
           <w:rFonts w:ascii="Arial" w:hAnsi="Arial"/>
-          <w:sz w:val="22"/>
-        </w:rPr>
-        <w:t>• </w:t>
-      </w:r>
-      <w:r>
-        <w:rPr>
-          <w:rFonts w:ascii="Arial" w:hAnsi="Arial"/>
-          <w:sz w:val="22"/>
-          <w:szCs w:val="22"/>
-        </w:rPr>
-        <w:t xml:space="preserve">Admin Utama OPD / Operator: </w:t>
-      </w:r>
-      <w:r>
-        <w:rPr>
-          <w:rFonts w:ascii="Arial" w:hAnsi="Arial"/>
-          <w:sz w:val="22"/>
-          <w:szCs w:val="22"/>
-          <w:b/>
-        </w:rPr>
-        <w:t xml:space="preserve">50,00%</w:t>
-      </w:r>
-      <w:r>
-        <w:rPr>
-          <w:rFonts w:ascii="Arial" w:hAnsi="Arial"/>
-          <w:sz w:val="22"/>
-          <w:szCs w:val="22"/>
-        </w:rPr>
-        <w:t xml:space="preserve"> (14 orang)</w:t>
+          <w:b/>
+          <w:sz w:val="22"/>
+        </w:rPr>
+        <w:t>4. </w:t>
+      </w:r>
+      <w:r>
+        <w:rPr>
+          <w:rFonts w:ascii="Arial" w:hAnsi="Arial"/>
+          <w:sz w:val="22"/>
+          <w:szCs w:val="22"/>
+          <w:b/>
+        </w:rPr>
+        <w:t xml:space="preserve">Jabatan/Peran dalam Pengelola PPID</w:t>
+      </w:r>
+      <w:r>
+        <w:rPr>
+          <w:rFonts w:ascii="Arial" w:hAnsi="Arial"/>
+          <w:sz w:val="22"/>
+          <w:szCs w:val="22"/>
+        </w:rPr>
+        <w:t xml:space="preserve">:</w:t>
       </w:r>
     </w:p>
     <w:p>
@@ -945,24 +907,24 @@
           <w:sz w:val="22"/>
           <w:szCs w:val="22"/>
         </w:rPr>
-        <w:t xml:space="preserve">Pejabat Fungsional / Struktural: </w:t>
-      </w:r>
-      <w:r>
-        <w:rPr>
-          <w:rFonts w:ascii="Arial" w:hAnsi="Arial"/>
-          <w:sz w:val="22"/>
-          <w:szCs w:val="22"/>
-          <w:b/>
-        </w:rPr>
-        <w:t xml:space="preserve">17,86%</w:t>
-      </w:r>
-      <w:r>
-        <w:rPr>
-          <w:rFonts w:ascii="Arial" w:hAnsi="Arial"/>
-          <w:sz w:val="22"/>
-          <w:szCs w:val="22"/>
-        </w:rPr>
-        <w:t xml:space="preserve"> (5 orang)</w:t>
+        <w:t xml:space="preserve">Admin Utama OPD / Operator: </w:t>
+      </w:r>
+      <w:r>
+        <w:rPr>
+          <w:rFonts w:ascii="Arial" w:hAnsi="Arial"/>
+          <w:sz w:val="22"/>
+          <w:szCs w:val="22"/>
+          <w:b/>
+        </w:rPr>
+        <w:t xml:space="preserve">50,00%</w:t>
+      </w:r>
+      <w:r>
+        <w:rPr>
+          <w:rFonts w:ascii="Arial" w:hAnsi="Arial"/>
+          <w:sz w:val="22"/>
+          <w:szCs w:val="22"/>
+        </w:rPr>
+        <w:t xml:space="preserve"> (14 orang)</w:t>
       </w:r>
     </w:p>
     <w:p>
@@ -983,24 +945,24 @@
           <w:sz w:val="22"/>
           <w:szCs w:val="22"/>
         </w:rPr>
-        <w:t xml:space="preserve">Lainnya: </w:t>
-      </w:r>
-      <w:r>
-        <w:rPr>
-          <w:rFonts w:ascii="Arial" w:hAnsi="Arial"/>
-          <w:sz w:val="22"/>
-          <w:szCs w:val="22"/>
-          <w:b/>
-        </w:rPr>
-        <w:t xml:space="preserve">32,14%</w:t>
-      </w:r>
-      <w:r>
-        <w:rPr>
-          <w:rFonts w:ascii="Arial" w:hAnsi="Arial"/>
-          <w:sz w:val="22"/>
-          <w:szCs w:val="22"/>
-        </w:rPr>
-        <w:t xml:space="preserve"> (9 orang)</w:t>
+        <w:t xml:space="preserve">Pejabat Fungsional / Struktural: </w:t>
+      </w:r>
+      <w:r>
+        <w:rPr>
+          <w:rFonts w:ascii="Arial" w:hAnsi="Arial"/>
+          <w:sz w:val="22"/>
+          <w:szCs w:val="22"/>
+          <w:b/>
+        </w:rPr>
+        <w:t xml:space="preserve">17,86%</w:t>
+      </w:r>
+      <w:r>
+        <w:rPr>
+          <w:rFonts w:ascii="Arial" w:hAnsi="Arial"/>
+          <w:sz w:val="22"/>
+          <w:szCs w:val="22"/>
+        </w:rPr>
+        <w:t xml:space="preserve"> (5 orang)</w:t>
       </w:r>
     </w:p>
     <w:p>
@@ -1020,48 +982,25 @@
           <w:rFonts w:ascii="Arial" w:hAnsi="Arial"/>
           <w:sz w:val="22"/>
           <w:szCs w:val="22"/>
-          <w:i/>
-        </w:rPr>
-        <w:t xml:space="preserve">Analisis</w:t>
-      </w:r>
-      <w:r>
-        <w:rPr>
-          <w:rFonts w:ascii="Arial" w:hAnsi="Arial"/>
-          <w:sz w:val="22"/>
-          <w:szCs w:val="22"/>
-        </w:rPr>
-        <w:t xml:space="preserve">: Sebagian besar pengguna aktif di dashboard adalah staf operator teknis yang memegang tanggung jawab langsung dalam input data harian.</w:t>
-      </w:r>
-    </w:p>
-    <w:p>
-      <w:pPr>
-        <w:spacing w:before="120" w:after="120"/>
-        <w:jc w:val="both"/>
-      </w:pPr>
-      <w:r>
-        <w:rPr>
-          <w:rFonts w:ascii="Arial" w:hAnsi="Arial"/>
-          <w:sz w:val="22"/>
-          <w:szCs w:val="22"/>
-        </w:rPr>
-        <w:t xml:space="preserve">2.  </w:t>
-      </w:r>
-      <w:r>
-        <w:rPr>
-          <w:rFonts w:ascii="Arial" w:hAnsi="Arial"/>
-          <w:sz w:val="22"/>
-          <w:szCs w:val="22"/>
-          <w:b/>
-        </w:rPr>
-        <w:t xml:space="preserve">Lama Mengelola Data PPID</w:t>
-      </w:r>
-      <w:r>
-        <w:rPr>
-          <w:rFonts w:ascii="Arial" w:hAnsi="Arial"/>
-          <w:sz w:val="22"/>
-          <w:szCs w:val="22"/>
-        </w:rPr>
-        <w:t xml:space="preserve">:</w:t>
+        </w:rPr>
+        <w:t xml:space="preserve">Lainnya: </w:t>
+      </w:r>
+      <w:r>
+        <w:rPr>
+          <w:rFonts w:ascii="Arial" w:hAnsi="Arial"/>
+          <w:sz w:val="22"/>
+          <w:szCs w:val="22"/>
+          <w:b/>
+        </w:rPr>
+        <w:t xml:space="preserve">32,14%</w:t>
+      </w:r>
+      <w:r>
+        <w:rPr>
+          <w:rFonts w:ascii="Arial" w:hAnsi="Arial"/>
+          <w:sz w:val="22"/>
+          <w:szCs w:val="22"/>
+        </w:rPr>
+        <w:t xml:space="preserve"> (9 orang)</w:t>
       </w:r>
     </w:p>
     <w:p>
@@ -1081,25 +1020,17 @@
           <w:rFonts w:ascii="Arial" w:hAnsi="Arial"/>
           <w:sz w:val="22"/>
           <w:szCs w:val="22"/>
-        </w:rPr>
-        <w:t xml:space="preserve">&lt; 1 Tahun: </w:t>
-      </w:r>
-      <w:r>
-        <w:rPr>
-          <w:rFonts w:ascii="Arial" w:hAnsi="Arial"/>
-          <w:sz w:val="22"/>
-          <w:szCs w:val="22"/>
-          <w:b/>
-        </w:rPr>
-        <w:t xml:space="preserve">57,14%</w:t>
-      </w:r>
-      <w:r>
-        <w:rPr>
-          <w:rFonts w:ascii="Arial" w:hAnsi="Arial"/>
-          <w:sz w:val="22"/>
-          <w:szCs w:val="22"/>
-        </w:rPr>
-        <w:t xml:space="preserve"> (16 orang)</w:t>
+          <w:i/>
+        </w:rPr>
+        <w:t xml:space="preserve">Analisis</w:t>
+      </w:r>
+      <w:r>
+        <w:rPr>
+          <w:rFonts w:ascii="Arial" w:hAnsi="Arial"/>
+          <w:sz w:val="22"/>
+          <w:szCs w:val="22"/>
+        </w:rPr>
+        <w:t xml:space="preserve">: Sebagian besar pengguna aktif di dashboard adalah staf operator teknis yang memegang tanggung jawab langsung dalam input data harian.</w:t>
       </w:r>
     </w:p>
     <w:p>
@@ -1110,34 +1041,27 @@
       <w:r>
         <w:rPr>
           <w:rFonts w:ascii="Arial" w:hAnsi="Arial"/>
-          <w:sz w:val="22"/>
-        </w:rPr>
-        <w:t>• </w:t>
-      </w:r>
-      <w:r>
-        <w:rPr>
-          <w:rFonts w:ascii="Arial" w:hAnsi="Arial"/>
-          <w:sz w:val="22"/>
-          <w:szCs w:val="22"/>
-        </w:rPr>
-        <w:t xml:space="preserve">1 - 3 Tahun: </w:t>
-      </w:r>
-      <w:r>
-        <w:rPr>
-          <w:rFonts w:ascii="Arial" w:hAnsi="Arial"/>
-          <w:sz w:val="22"/>
-          <w:szCs w:val="22"/>
-          <w:b/>
-        </w:rPr>
-        <w:t xml:space="preserve">21,43%</w:t>
-      </w:r>
-      <w:r>
-        <w:rPr>
-          <w:rFonts w:ascii="Arial" w:hAnsi="Arial"/>
-          <w:sz w:val="22"/>
-          <w:szCs w:val="22"/>
-        </w:rPr>
-        <w:t xml:space="preserve"> (6 orang)</w:t>
+          <w:b/>
+          <w:sz w:val="22"/>
+        </w:rPr>
+        <w:t>5. </w:t>
+      </w:r>
+      <w:r>
+        <w:rPr>
+          <w:rFonts w:ascii="Arial" w:hAnsi="Arial"/>
+          <w:sz w:val="22"/>
+          <w:szCs w:val="22"/>
+          <w:b/>
+        </w:rPr>
+        <w:t xml:space="preserve">Lama Mengelola Data PPID</w:t>
+      </w:r>
+      <w:r>
+        <w:rPr>
+          <w:rFonts w:ascii="Arial" w:hAnsi="Arial"/>
+          <w:sz w:val="22"/>
+          <w:szCs w:val="22"/>
+        </w:rPr>
+        <w:t xml:space="preserve">:</w:t>
       </w:r>
     </w:p>
     <w:p>
@@ -1158,24 +1082,24 @@
           <w:sz w:val="22"/>
           <w:szCs w:val="22"/>
         </w:rPr>
-        <w:t xml:space="preserve">&gt; 3 Tahun: </w:t>
-      </w:r>
-      <w:r>
-        <w:rPr>
-          <w:rFonts w:ascii="Arial" w:hAnsi="Arial"/>
-          <w:sz w:val="22"/>
-          <w:szCs w:val="22"/>
-          <w:b/>
-        </w:rPr>
-        <w:t xml:space="preserve">21,43%</w:t>
-      </w:r>
-      <w:r>
-        <w:rPr>
-          <w:rFonts w:ascii="Arial" w:hAnsi="Arial"/>
-          <w:sz w:val="22"/>
-          <w:szCs w:val="22"/>
-        </w:rPr>
-        <w:t xml:space="preserve"> (6 orang)</w:t>
+        <w:t xml:space="preserve">&lt; 1 Tahun: </w:t>
+      </w:r>
+      <w:r>
+        <w:rPr>
+          <w:rFonts w:ascii="Arial" w:hAnsi="Arial"/>
+          <w:sz w:val="22"/>
+          <w:szCs w:val="22"/>
+          <w:b/>
+        </w:rPr>
+        <w:t xml:space="preserve">57,14%</w:t>
+      </w:r>
+      <w:r>
+        <w:rPr>
+          <w:rFonts w:ascii="Arial" w:hAnsi="Arial"/>
+          <w:sz w:val="22"/>
+          <w:szCs w:val="22"/>
+        </w:rPr>
+        <w:t xml:space="preserve"> (16 orang)</w:t>
       </w:r>
     </w:p>
     <w:p>
@@ -1195,6 +1119,82 @@
           <w:rFonts w:ascii="Arial" w:hAnsi="Arial"/>
           <w:sz w:val="22"/>
           <w:szCs w:val="22"/>
+        </w:rPr>
+        <w:t xml:space="preserve">1 - 3 Tahun: </w:t>
+      </w:r>
+      <w:r>
+        <w:rPr>
+          <w:rFonts w:ascii="Arial" w:hAnsi="Arial"/>
+          <w:sz w:val="22"/>
+          <w:szCs w:val="22"/>
+          <w:b/>
+        </w:rPr>
+        <w:t xml:space="preserve">21,43%</w:t>
+      </w:r>
+      <w:r>
+        <w:rPr>
+          <w:rFonts w:ascii="Arial" w:hAnsi="Arial"/>
+          <w:sz w:val="22"/>
+          <w:szCs w:val="22"/>
+        </w:rPr>
+        <w:t xml:space="preserve"> (6 orang)</w:t>
+      </w:r>
+    </w:p>
+    <w:p>
+      <w:pPr>
+        <w:spacing w:before="60" w:after="60"/>
+        <w:ind w:left="360" w:hanging="180"/>
+      </w:pPr>
+      <w:r>
+        <w:rPr>
+          <w:rFonts w:ascii="Arial" w:hAnsi="Arial"/>
+          <w:sz w:val="22"/>
+        </w:rPr>
+        <w:t>• </w:t>
+      </w:r>
+      <w:r>
+        <w:rPr>
+          <w:rFonts w:ascii="Arial" w:hAnsi="Arial"/>
+          <w:sz w:val="22"/>
+          <w:szCs w:val="22"/>
+        </w:rPr>
+        <w:t xml:space="preserve">&gt; 3 Tahun: </w:t>
+      </w:r>
+      <w:r>
+        <w:rPr>
+          <w:rFonts w:ascii="Arial" w:hAnsi="Arial"/>
+          <w:sz w:val="22"/>
+          <w:szCs w:val="22"/>
+          <w:b/>
+        </w:rPr>
+        <w:t xml:space="preserve">21,43%</w:t>
+      </w:r>
+      <w:r>
+        <w:rPr>
+          <w:rFonts w:ascii="Arial" w:hAnsi="Arial"/>
+          <w:sz w:val="22"/>
+          <w:szCs w:val="22"/>
+        </w:rPr>
+        <w:t xml:space="preserve"> (6 orang)</w:t>
+      </w:r>
+    </w:p>
+    <w:p>
+      <w:pPr>
+        <w:spacing w:before="60" w:after="60"/>
+        <w:ind w:left="360" w:hanging="180"/>
+      </w:pPr>
+      <w:r>
+        <w:rPr>
+          <w:rFonts w:ascii="Arial" w:hAnsi="Arial"/>
+          <w:sz w:val="22"/>
+        </w:rPr>
+        <w:t>• </w:t>
+      </w:r>
+      <w:r>
+        <w:rPr>
+          <w:rFonts w:ascii="Arial" w:hAnsi="Arial"/>
+          <w:sz w:val="22"/>
+          <w:szCs w:val="22"/>
           <w:i/>
         </w:rPr>
         <w:t xml:space="preserve">Analisis</w:t>
@@ -1227,16 +1227,16 @@
     </w:p>
     <w:p>
       <w:pPr>
-        <w:spacing w:before="120" w:after="120"/>
-        <w:jc w:val="both"/>
-      </w:pPr>
-      <w:r>
-        <w:rPr>
-          <w:rFonts w:ascii="Arial" w:hAnsi="Arial"/>
-          <w:sz w:val="22"/>
-          <w:szCs w:val="22"/>
-        </w:rPr>
-        <w:t xml:space="preserve">3.  </w:t>
+        <w:spacing w:before="60" w:after="60"/>
+        <w:ind w:left="360" w:hanging="180"/>
+      </w:pPr>
+      <w:r>
+        <w:rPr>
+          <w:rFonts w:ascii="Arial" w:hAnsi="Arial"/>
+          <w:b/>
+          <w:sz w:val="22"/>
+        </w:rPr>
+        <w:t>6. </w:t>
       </w:r>
       <w:r>
         <w:rPr>
@@ -3408,6 +3408,37 @@
     </w:p>
     <w:p>
       <w:pPr>
+        <w:spacing w:before="60" w:after="60"/>
+        <w:ind w:left="360" w:hanging="180"/>
+      </w:pPr>
+      <w:r>
+        <w:rPr>
+          <w:rFonts w:ascii="Arial" w:hAnsi="Arial"/>
+          <w:b/>
+          <w:sz w:val="22"/>
+        </w:rPr>
+        <w:t>7. </w:t>
+      </w:r>
+      <w:r>
+        <w:rPr>
+          <w:rFonts w:ascii="Arial" w:hAnsi="Arial"/>
+          <w:sz w:val="22"/>
+          <w:szCs w:val="22"/>
+          <w:b/>
+        </w:rPr>
+        <w:t xml:space="preserve">Sistem Pesan Kesalahan (Error Handling) yang Buruk (Temuan Utama)</w:t>
+      </w:r>
+      <w:r>
+        <w:rPr>
+          <w:rFonts w:ascii="Arial" w:hAnsi="Arial"/>
+          <w:sz w:val="22"/>
+          <w:szCs w:val="22"/>
+        </w:rPr>
+        <w:t xml:space="preserve">:</w:t>
+      </w:r>
+    </w:p>
+    <w:p>
+      <w:pPr>
         <w:spacing w:before="120" w:after="120"/>
         <w:jc w:val="both"/>
       </w:pPr>
@@ -3417,16 +3448,47 @@
           <w:sz w:val="22"/>
           <w:szCs w:val="22"/>
         </w:rPr>
-        <w:t xml:space="preserve">1.  </w:t>
-      </w:r>
-      <w:r>
-        <w:rPr>
-          <w:rFonts w:ascii="Arial" w:hAnsi="Arial"/>
-          <w:sz w:val="22"/>
-          <w:szCs w:val="22"/>
-          <w:b/>
-        </w:rPr>
-        <w:t xml:space="preserve">Sistem Pesan Kesalahan (Error Handling) yang Buruk (Temuan Utama)</w:t>
+        <w:t xml:space="preserve">Sebanyak </w:t>
+      </w:r>
+      <w:r>
+        <w:rPr>
+          <w:rFonts w:ascii="Arial" w:hAnsi="Arial"/>
+          <w:sz w:val="22"/>
+          <w:szCs w:val="22"/>
+          <w:b/>
+        </w:rPr>
+        <w:t xml:space="preserve">96,43%</w:t>
+      </w:r>
+      <w:r>
+        <w:rPr>
+          <w:rFonts w:ascii="Arial" w:hAnsi="Arial"/>
+          <w:sz w:val="22"/>
+          <w:szCs w:val="22"/>
+        </w:rPr>
+        <w:t xml:space="preserve"> responden memberikan skor terendah (skor 1) pada kejelasan pesan kesalahan yang dimunculkan oleh sistem saat terjadi kekeliruan pengisian. Hal ini menunjukkan bahwa sistem tidak memberikan instruksi perbaikan yang jelas ketika terjadi kegagalan validasi formulir (misalnya format file salah atau ukuran melebihi batas). Dampak dari temuan ini adalah admin OPD mengalami kebingungan dan frustrasi karena harus menebak-nebak letak kesalahan input data mereka.</w:t>
+      </w:r>
+    </w:p>
+    <w:p>
+      <w:pPr>
+        <w:spacing w:before="60" w:after="60"/>
+        <w:ind w:left="360" w:hanging="180"/>
+      </w:pPr>
+      <w:r>
+        <w:rPr>
+          <w:rFonts w:ascii="Arial" w:hAnsi="Arial"/>
+          <w:b/>
+          <w:sz w:val="22"/>
+        </w:rPr>
+        <w:t>8. </w:t>
+      </w:r>
+      <w:r>
+        <w:rPr>
+          <w:rFonts w:ascii="Arial" w:hAnsi="Arial"/>
+          <w:sz w:val="22"/>
+          <w:szCs w:val="22"/>
+          <w:b/>
+        </w:rPr>
+        <w:t xml:space="preserve">Kebutuhan Optimalisasi Tampilan Visual (Dashboard UI)</w:t>
       </w:r>
       <w:r>
         <w:rPr>
@@ -3457,15 +3519,46 @@
           <w:szCs w:val="22"/>
           <w:b/>
         </w:rPr>
-        <w:t xml:space="preserve">96,43%</w:t>
-      </w:r>
-      <w:r>
-        <w:rPr>
-          <w:rFonts w:ascii="Arial" w:hAnsi="Arial"/>
-          <w:sz w:val="22"/>
-          <w:szCs w:val="22"/>
-        </w:rPr>
-        <w:t xml:space="preserve"> responden memberikan skor terendah (skor 1) pada kejelasan pesan kesalahan yang dimunculkan oleh sistem saat terjadi kekeliruan pengisian. Hal ini menunjukkan bahwa sistem tidak memberikan instruksi perbaikan yang jelas ketika terjadi kegagalan validasi formulir (misalnya format file salah atau ukuran melebihi batas). Dampak dari temuan ini adalah admin OPD mengalami kebingungan dan frustrasi karena harus menebak-nebak letak kesalahan input data mereka.</w:t>
+        <w:t xml:space="preserve">50,00%</w:t>
+      </w:r>
+      <w:r>
+        <w:rPr>
+          <w:rFonts w:ascii="Arial" w:hAnsi="Arial"/>
+          <w:sz w:val="22"/>
+          <w:szCs w:val="22"/>
+        </w:rPr>
+        <w:t xml:space="preserve"> responden menilai visual antarmuka dengan skor 2 (cukup/kurang). Evaluasi estetika dashboard dinilai kurang membantu fokus kerja operator dalam menginput data secara harian, sehingga memerlukan pembaruan desain antarmuka yang lebih rapi, modern, dan intuitif.</w:t>
+      </w:r>
+    </w:p>
+    <w:p>
+      <w:pPr>
+        <w:spacing w:before="60" w:after="60"/>
+        <w:ind w:left="360" w:hanging="180"/>
+      </w:pPr>
+      <w:r>
+        <w:rPr>
+          <w:rFonts w:ascii="Arial" w:hAnsi="Arial"/>
+          <w:b/>
+          <w:sz w:val="22"/>
+        </w:rPr>
+        <w:t>9. </w:t>
+      </w:r>
+      <w:r>
+        <w:rPr>
+          <w:rFonts w:ascii="Arial" w:hAnsi="Arial"/>
+          <w:sz w:val="22"/>
+          <w:szCs w:val="22"/>
+          <w:b/>
+        </w:rPr>
+        <w:t xml:space="preserve">Peningkatan Produktivitas Kerja</w:t>
+      </w:r>
+      <w:r>
+        <w:rPr>
+          <w:rFonts w:ascii="Arial" w:hAnsi="Arial"/>
+          <w:sz w:val="22"/>
+          <w:szCs w:val="22"/>
+        </w:rPr>
+        <w:t xml:space="preserve">:</w:t>
       </w:r>
     </w:p>
     <w:p>
@@ -3479,99 +3572,6 @@
           <w:sz w:val="22"/>
           <w:szCs w:val="22"/>
         </w:rPr>
-        <w:t xml:space="preserve">2.  </w:t>
-      </w:r>
-      <w:r>
-        <w:rPr>
-          <w:rFonts w:ascii="Arial" w:hAnsi="Arial"/>
-          <w:sz w:val="22"/>
-          <w:szCs w:val="22"/>
-          <w:b/>
-        </w:rPr>
-        <w:t xml:space="preserve">Kebutuhan Optimalisasi Tampilan Visual (Dashboard UI)</w:t>
-      </w:r>
-      <w:r>
-        <w:rPr>
-          <w:rFonts w:ascii="Arial" w:hAnsi="Arial"/>
-          <w:sz w:val="22"/>
-          <w:szCs w:val="22"/>
-        </w:rPr>
-        <w:t xml:space="preserve">:</w:t>
-      </w:r>
-    </w:p>
-    <w:p>
-      <w:pPr>
-        <w:spacing w:before="120" w:after="120"/>
-        <w:jc w:val="both"/>
-      </w:pPr>
-      <w:r>
-        <w:rPr>
-          <w:rFonts w:ascii="Arial" w:hAnsi="Arial"/>
-          <w:sz w:val="22"/>
-          <w:szCs w:val="22"/>
-        </w:rPr>
-        <w:t xml:space="preserve">Sebanyak </w:t>
-      </w:r>
-      <w:r>
-        <w:rPr>
-          <w:rFonts w:ascii="Arial" w:hAnsi="Arial"/>
-          <w:sz w:val="22"/>
-          <w:szCs w:val="22"/>
-          <w:b/>
-        </w:rPr>
-        <w:t xml:space="preserve">50,00%</w:t>
-      </w:r>
-      <w:r>
-        <w:rPr>
-          <w:rFonts w:ascii="Arial" w:hAnsi="Arial"/>
-          <w:sz w:val="22"/>
-          <w:szCs w:val="22"/>
-        </w:rPr>
-        <w:t xml:space="preserve"> responden menilai visual antarmuka dengan skor 2 (cukup/kurang). Evaluasi estetika dashboard dinilai kurang membantu fokus kerja operator dalam menginput data secara harian, sehingga memerlukan pembaruan desain antarmuka yang lebih rapi, modern, dan intuitif.</w:t>
-      </w:r>
-    </w:p>
-    <w:p>
-      <w:pPr>
-        <w:spacing w:before="120" w:after="120"/>
-        <w:jc w:val="both"/>
-      </w:pPr>
-      <w:r>
-        <w:rPr>
-          <w:rFonts w:ascii="Arial" w:hAnsi="Arial"/>
-          <w:sz w:val="22"/>
-          <w:szCs w:val="22"/>
-        </w:rPr>
-        <w:t xml:space="preserve">3.  </w:t>
-      </w:r>
-      <w:r>
-        <w:rPr>
-          <w:rFonts w:ascii="Arial" w:hAnsi="Arial"/>
-          <w:sz w:val="22"/>
-          <w:szCs w:val="22"/>
-          <w:b/>
-        </w:rPr>
-        <w:t xml:space="preserve">Peningkatan Produktivitas Kerja</w:t>
-      </w:r>
-      <w:r>
-        <w:rPr>
-          <w:rFonts w:ascii="Arial" w:hAnsi="Arial"/>
-          <w:sz w:val="22"/>
-          <w:szCs w:val="22"/>
-        </w:rPr>
-        <w:t xml:space="preserve">:</w:t>
-      </w:r>
-    </w:p>
-    <w:p>
-      <w:pPr>
-        <w:spacing w:before="120" w:after="120"/>
-        <w:jc w:val="both"/>
-      </w:pPr>
-      <w:r>
-        <w:rPr>
-          <w:rFonts w:ascii="Arial" w:hAnsi="Arial"/>
-          <w:sz w:val="22"/>
-          <w:szCs w:val="22"/>
-        </w:rPr>
         <w:t xml:space="preserve">Sisi positif yang sangat menonjol adalah </w:t>
       </w:r>
       <w:r>
@@ -3589,7 +3589,7 @@
           <w:sz w:val="22"/>
           <w:szCs w:val="22"/>
         </w:rPr>
-        <w:t xml:space="preserve"> responden sepakat bahwa keberadaan website PPID v2 ini meningkatkan produktivitas pelaporan berkas publik mereka secara signifikan dibandingkan sistem pengumpulan manual sebelumnya. Hal ini membuktikan pentingnya kelanjutan operasional aplikasi ini demi efisiensi birokrasi.</w:t>
+        <w:t xml:space="preserve"> responden sepakat bahwa keberadaan website PPID hasil optimalisasi yang baru ini meningkatkan produktivitas pelaporan berkas publik mereka secara signifikan dibandingkan sistem pengumpulan manual sebelumnya. Hal ini membuktikan pentingnya kelanjutan operasional aplikasi ini demi efisiensi birokrasi.</w:t>
       </w:r>
     </w:p>
     <w:p>
@@ -3624,16 +3624,16 @@
     </w:p>
     <w:p>
       <w:pPr>
-        <w:spacing w:before="120" w:after="120"/>
-        <w:jc w:val="both"/>
-      </w:pPr>
-      <w:r>
-        <w:rPr>
-          <w:rFonts w:ascii="Arial" w:hAnsi="Arial"/>
-          <w:sz w:val="22"/>
-          <w:szCs w:val="22"/>
-        </w:rPr>
-        <w:t xml:space="preserve">1.  </w:t>
+        <w:spacing w:before="60" w:after="60"/>
+        <w:ind w:left="360" w:hanging="180"/>
+      </w:pPr>
+      <w:r>
+        <w:rPr>
+          <w:rFonts w:ascii="Arial" w:hAnsi="Arial"/>
+          <w:b/>
+          <w:sz w:val="22"/>
+        </w:rPr>
+        <w:t>10. </w:t>
       </w:r>
       <w:r>
         <w:rPr>
@@ -3655,16 +3655,16 @@
     </w:p>
     <w:p>
       <w:pPr>
-        <w:spacing w:before="120" w:after="120"/>
-        <w:jc w:val="both"/>
-      </w:pPr>
-      <w:r>
-        <w:rPr>
-          <w:rFonts w:ascii="Arial" w:hAnsi="Arial"/>
-          <w:sz w:val="22"/>
-          <w:szCs w:val="22"/>
-        </w:rPr>
-        <w:t xml:space="preserve">2.  </w:t>
+        <w:spacing w:before="60" w:after="60"/>
+        <w:ind w:left="360" w:hanging="180"/>
+      </w:pPr>
+      <w:r>
+        <w:rPr>
+          <w:rFonts w:ascii="Arial" w:hAnsi="Arial"/>
+          <w:b/>
+          <w:sz w:val="22"/>
+        </w:rPr>
+        <w:t>11. </w:t>
       </w:r>
       <w:r>
         <w:rPr>
@@ -3703,16 +3703,16 @@
     </w:p>
     <w:p>
       <w:pPr>
-        <w:spacing w:before="120" w:after="120"/>
-        <w:jc w:val="both"/>
-      </w:pPr>
-      <w:r>
-        <w:rPr>
-          <w:rFonts w:ascii="Arial" w:hAnsi="Arial"/>
-          <w:sz w:val="22"/>
-          <w:szCs w:val="22"/>
-        </w:rPr>
-        <w:t xml:space="preserve">3.  </w:t>
+        <w:spacing w:before="60" w:after="60"/>
+        <w:ind w:left="360" w:hanging="180"/>
+      </w:pPr>
+      <w:r>
+        <w:rPr>
+          <w:rFonts w:ascii="Arial" w:hAnsi="Arial"/>
+          <w:b/>
+          <w:sz w:val="22"/>
+        </w:rPr>
+        <w:t>12. </w:t>
       </w:r>
       <w:r>
         <w:rPr>
@@ -3764,6 +3764,37 @@
     </w:p>
     <w:p>
       <w:pPr>
+        <w:spacing w:before="60" w:after="60"/>
+        <w:ind w:left="360" w:hanging="180"/>
+      </w:pPr>
+      <w:r>
+        <w:rPr>
+          <w:rFonts w:ascii="Arial" w:hAnsi="Arial"/>
+          <w:b/>
+          <w:sz w:val="22"/>
+        </w:rPr>
+        <w:t>13. </w:t>
+      </w:r>
+      <w:r>
+        <w:rPr>
+          <w:rFonts w:ascii="Arial" w:hAnsi="Arial"/>
+          <w:sz w:val="22"/>
+          <w:szCs w:val="22"/>
+          <w:b/>
+        </w:rPr>
+        <w:t xml:space="preserve">Fitur Pemantau Kelengkapan Dokumen Mandiri (Self-Monitoring Progress)</w:t>
+      </w:r>
+      <w:r>
+        <w:rPr>
+          <w:rFonts w:ascii="Arial" w:hAnsi="Arial"/>
+          <w:sz w:val="22"/>
+          <w:szCs w:val="22"/>
+        </w:rPr>
+        <w:t xml:space="preserve">:</w:t>
+      </w:r>
+    </w:p>
+    <w:p>
+      <w:pPr>
         <w:spacing w:before="120" w:after="120"/>
         <w:jc w:val="both"/>
       </w:pPr>
@@ -3773,16 +3804,30 @@
           <w:sz w:val="22"/>
           <w:szCs w:val="22"/>
         </w:rPr>
-        <w:t xml:space="preserve">1.  </w:t>
-      </w:r>
-      <w:r>
-        <w:rPr>
-          <w:rFonts w:ascii="Arial" w:hAnsi="Arial"/>
-          <w:sz w:val="22"/>
-          <w:szCs w:val="22"/>
-          <w:b/>
-        </w:rPr>
-        <w:t xml:space="preserve">Fitur Pemantau Kelengkapan Dokumen Mandiri (Self-Monitoring Progress)</w:t>
+        <w:t xml:space="preserve">Admin OPD mengharapkan adanya dashboard khusus untuk memantau status persentase kelengkapan dokumen instansi mereka sendiri. Dengan fitur ini, admin OPD dapat mengetahui secara langsung dokumen mana yang belum diunggah atau perlu diperbarui tanpa harus menunggu evaluasi manual dari PPID Utama Diskominfo.</w:t>
+      </w:r>
+    </w:p>
+    <w:p>
+      <w:pPr>
+        <w:spacing w:before="60" w:after="60"/>
+        <w:ind w:left="360" w:hanging="180"/>
+      </w:pPr>
+      <w:r>
+        <w:rPr>
+          <w:rFonts w:ascii="Arial" w:hAnsi="Arial"/>
+          <w:b/>
+          <w:sz w:val="22"/>
+        </w:rPr>
+        <w:t>14. </w:t>
+      </w:r>
+      <w:r>
+        <w:rPr>
+          <w:rFonts w:ascii="Arial" w:hAnsi="Arial"/>
+          <w:sz w:val="22"/>
+          <w:szCs w:val="22"/>
+          <w:b/>
+        </w:rPr>
+        <w:t xml:space="preserve">Integrasi Satu Pintu</w:t>
       </w:r>
       <w:r>
         <w:rPr>
@@ -3804,66 +3849,21 @@
           <w:sz w:val="22"/>
           <w:szCs w:val="22"/>
         </w:rPr>
-        <w:t xml:space="preserve">Admin OPD mengharapkan adanya dashboard khusus untuk memantau status persentase kelengkapan dokumen instansi mereka sendiri. Dengan fitur ini, admin OPD dapat mengetahui secara langsung dokumen mana yang belum diunggah atau perlu diperbarui tanpa harus menunggu evaluasi manual dari PPID Utama Diskominfo.</w:t>
-      </w:r>
-    </w:p>
-    <w:p>
-      <w:pPr>
-        <w:spacing w:before="120" w:after="120"/>
-        <w:jc w:val="both"/>
-      </w:pPr>
-      <w:r>
-        <w:rPr>
-          <w:rFonts w:ascii="Arial" w:hAnsi="Arial"/>
-          <w:sz w:val="22"/>
-          <w:szCs w:val="22"/>
-        </w:rPr>
-        <w:t xml:space="preserve">2.  </w:t>
-      </w:r>
-      <w:r>
-        <w:rPr>
-          <w:rFonts w:ascii="Arial" w:hAnsi="Arial"/>
-          <w:sz w:val="22"/>
-          <w:szCs w:val="22"/>
-          <w:b/>
-        </w:rPr>
-        <w:t xml:space="preserve">Integrasi Satu Pintu</w:t>
-      </w:r>
-      <w:r>
-        <w:rPr>
-          <w:rFonts w:ascii="Arial" w:hAnsi="Arial"/>
-          <w:sz w:val="22"/>
-          <w:szCs w:val="22"/>
-        </w:rPr>
-        <w:t xml:space="preserve">:</w:t>
-      </w:r>
-    </w:p>
-    <w:p>
-      <w:pPr>
-        <w:spacing w:before="120" w:after="120"/>
-        <w:jc w:val="both"/>
-      </w:pPr>
-      <w:r>
-        <w:rPr>
-          <w:rFonts w:ascii="Arial" w:hAnsi="Arial"/>
-          <w:sz w:val="22"/>
-          <w:szCs w:val="22"/>
-        </w:rPr>
         <w:t xml:space="preserve">Terkoneksinya dashboard PPID secara langsung dengan website internal OPD masing-masing agar operator tidak perlu melakukan proses unggah dokumen yang sama sebanyak dua kali.</w:t>
       </w:r>
     </w:p>
     <w:p>
       <w:pPr>
-        <w:spacing w:before="120" w:after="120"/>
-        <w:jc w:val="both"/>
-      </w:pPr>
-      <w:r>
-        <w:rPr>
-          <w:rFonts w:ascii="Arial" w:hAnsi="Arial"/>
-          <w:sz w:val="22"/>
-          <w:szCs w:val="22"/>
-        </w:rPr>
-        <w:t xml:space="preserve">3.  </w:t>
+        <w:spacing w:before="60" w:after="60"/>
+        <w:ind w:left="360" w:hanging="180"/>
+      </w:pPr>
+      <w:r>
+        <w:rPr>
+          <w:rFonts w:ascii="Arial" w:hAnsi="Arial"/>
+          <w:b/>
+          <w:sz w:val="22"/>
+        </w:rPr>
+        <w:t>15. </w:t>
       </w:r>
       <w:r>
         <w:rPr>
@@ -3957,7 +3957,7 @@
           <w:sz w:val="22"/>
           <w:szCs w:val="22"/>
         </w:rPr>
-        <w:t xml:space="preserve">Pengembangan website PPID v2 oleh Diskominfo Kabupaten Sinjai secara empiris terbukti sukses meningkatkan produktivitas kerja admin OPD dalam melaporkan data keterbukaan informasi publik (100% respon positif). Sistem pengkategorian dokumen otomatis juga berjalan dengan sangat baik dan memudahkan operator. Namun, dari aspek </w:t>
+        <w:t xml:space="preserve">Optimalisasi website PPID oleh Diskominfo Kabupaten Sinjai secara empiris terbukti sukses meningkatkan produktivitas kerja admin OPD dalam melaporkan data keterbukaan informasi publik (100% respon positif) dibandingkan sistem sebelumnya. Sistem pengkategorian dokumen otomatis juga berjalan dengan sangat baik dan memudahkan operator. Namun, dari aspek </w:t>
       </w:r>
       <w:r>
         <w:rPr>
@@ -4026,16 +4026,16 @@
     </w:p>
     <w:p>
       <w:pPr>
-        <w:spacing w:before="120" w:after="120"/>
-        <w:jc w:val="both"/>
-      </w:pPr>
-      <w:r>
-        <w:rPr>
-          <w:rFonts w:ascii="Arial" w:hAnsi="Arial"/>
-          <w:sz w:val="22"/>
-          <w:szCs w:val="22"/>
-        </w:rPr>
-        <w:t xml:space="preserve">1.  </w:t>
+        <w:spacing w:before="60" w:after="60"/>
+        <w:ind w:left="360" w:hanging="180"/>
+      </w:pPr>
+      <w:r>
+        <w:rPr>
+          <w:rFonts w:ascii="Arial" w:hAnsi="Arial"/>
+          <w:b/>
+          <w:sz w:val="22"/>
+        </w:rPr>
+        <w:t>16. </w:t>
       </w:r>
       <w:r>
         <w:rPr>
@@ -4074,16 +4074,16 @@
     </w:p>
     <w:p>
       <w:pPr>
-        <w:spacing w:before="120" w:after="120"/>
-        <w:jc w:val="both"/>
-      </w:pPr>
-      <w:r>
-        <w:rPr>
-          <w:rFonts w:ascii="Arial" w:hAnsi="Arial"/>
-          <w:sz w:val="22"/>
-          <w:szCs w:val="22"/>
-        </w:rPr>
-        <w:t xml:space="preserve">2.  </w:t>
+        <w:spacing w:before="60" w:after="60"/>
+        <w:ind w:left="360" w:hanging="180"/>
+      </w:pPr>
+      <w:r>
+        <w:rPr>
+          <w:rFonts w:ascii="Arial" w:hAnsi="Arial"/>
+          <w:b/>
+          <w:sz w:val="22"/>
+        </w:rPr>
+        <w:t>17. </w:t>
       </w:r>
       <w:r>
         <w:rPr>
@@ -4105,16 +4105,16 @@
     </w:p>
     <w:p>
       <w:pPr>
-        <w:spacing w:before="120" w:after="120"/>
-        <w:jc w:val="both"/>
-      </w:pPr>
-      <w:r>
-        <w:rPr>
-          <w:rFonts w:ascii="Arial" w:hAnsi="Arial"/>
-          <w:sz w:val="22"/>
-          <w:szCs w:val="22"/>
-        </w:rPr>
-        <w:t xml:space="preserve">3.  </w:t>
+        <w:spacing w:before="60" w:after="60"/>
+        <w:ind w:left="360" w:hanging="180"/>
+      </w:pPr>
+      <w:r>
+        <w:rPr>
+          <w:rFonts w:ascii="Arial" w:hAnsi="Arial"/>
+          <w:b/>
+          <w:sz w:val="22"/>
+        </w:rPr>
+        <w:t>18. </w:t>
       </w:r>
       <w:r>
         <w:rPr>
@@ -4136,16 +4136,16 @@
     </w:p>
     <w:p>
       <w:pPr>
-        <w:spacing w:before="120" w:after="120"/>
-        <w:jc w:val="both"/>
-      </w:pPr>
-      <w:r>
-        <w:rPr>
-          <w:rFonts w:ascii="Arial" w:hAnsi="Arial"/>
-          <w:sz w:val="22"/>
-          <w:szCs w:val="22"/>
-        </w:rPr>
-        <w:t xml:space="preserve">4.  </w:t>
+        <w:spacing w:before="60" w:after="60"/>
+        <w:ind w:left="360" w:hanging="180"/>
+      </w:pPr>
+      <w:r>
+        <w:rPr>
+          <w:rFonts w:ascii="Arial" w:hAnsi="Arial"/>
+          <w:b/>
+          <w:sz w:val="22"/>
+        </w:rPr>
+        <w:t>19. </w:t>
       </w:r>
       <w:r>
         <w:rPr>
@@ -4180,6 +4180,420 @@
           <w:szCs w:val="22"/>
         </w:rPr>
         <w:t xml:space="preserve">) untuk memfasilitasi penginputan data saat koneksi internet operator tidak stabil.</w:t>
+      </w:r>
+    </w:p>
+    <w:p>
+      <w:pPr>
+        <w:pStyle w:val="Heading2"/>
+        <w:spacing w:before="240" w:after="120"/>
+        <w:keepNext/>
+      </w:pPr>
+      <w:r>
+        <w:rPr>
+          <w:rFonts w:ascii="Arial" w:hAnsi="Arial"/>
+          <w:b/>
+          <w:sz w:val="28"/>
+          <w:szCs w:val="28"/>
+        </w:rPr>
+        <w:t>DAFTAR PUSTAKA</w:t>
+      </w:r>
+    </w:p>
+    <w:p>
+      <w:pPr>
+        <w:spacing w:before="60" w:after="60"/>
+        <w:ind w:left="360" w:hanging="180"/>
+      </w:pPr>
+      <w:r>
+        <w:rPr>
+          <w:rFonts w:ascii="Arial" w:hAnsi="Arial"/>
+          <w:b/>
+          <w:sz w:val="22"/>
+        </w:rPr>
+        <w:t>20. </w:t>
+      </w:r>
+      <w:r>
+        <w:rPr>
+          <w:rFonts w:ascii="Arial" w:hAnsi="Arial"/>
+          <w:sz w:val="22"/>
+          <w:szCs w:val="22"/>
+          <w:b/>
+        </w:rPr>
+        <w:t xml:space="preserve">Bakhri, S., Haidir, A., &amp; Simamora, S. S. (2025)</w:t>
+      </w:r>
+      <w:r>
+        <w:rPr>
+          <w:rFonts w:ascii="Arial" w:hAnsi="Arial"/>
+          <w:sz w:val="22"/>
+          <w:szCs w:val="22"/>
+        </w:rPr>
+        <w:t xml:space="preserve">. Evaluasi Usability Website PPID Kabupaten Bogor dengan Metode System Usability Scale (SUS) di Diskominfo Kabupaten Bogor. </w:t>
+      </w:r>
+      <w:r>
+        <w:rPr>
+          <w:rFonts w:ascii="Arial" w:hAnsi="Arial"/>
+          <w:sz w:val="22"/>
+          <w:szCs w:val="22"/>
+          <w:i/>
+        </w:rPr>
+        <w:t xml:space="preserve">JISAMAR (Journal of Information System, Applied, Management, Accounting and Research)</w:t>
+      </w:r>
+      <w:r>
+        <w:rPr>
+          <w:rFonts w:ascii="Arial" w:hAnsi="Arial"/>
+          <w:sz w:val="22"/>
+          <w:szCs w:val="22"/>
+        </w:rPr>
+        <w:t xml:space="preserve">, 9(4), 512-520.</w:t>
+      </w:r>
+    </w:p>
+    <w:p>
+      <w:pPr>
+        <w:spacing w:before="60" w:after="60"/>
+        <w:ind w:left="360" w:hanging="180"/>
+      </w:pPr>
+      <w:r>
+        <w:rPr>
+          <w:rFonts w:ascii="Arial" w:hAnsi="Arial"/>
+          <w:b/>
+          <w:sz w:val="22"/>
+        </w:rPr>
+        <w:t>21. </w:t>
+      </w:r>
+      <w:r>
+        <w:rPr>
+          <w:rFonts w:ascii="Arial" w:hAnsi="Arial"/>
+          <w:sz w:val="22"/>
+          <w:szCs w:val="22"/>
+          <w:b/>
+        </w:rPr>
+        <w:t xml:space="preserve">Davis, F. D. (1989)</w:t>
+      </w:r>
+      <w:r>
+        <w:rPr>
+          <w:rFonts w:ascii="Arial" w:hAnsi="Arial"/>
+          <w:sz w:val="22"/>
+          <w:szCs w:val="22"/>
+        </w:rPr>
+        <w:t xml:space="preserve">. Perceived Usefulness, Perceived Ease of Use, and User Acceptance of Information Technology. </w:t>
+      </w:r>
+      <w:r>
+        <w:rPr>
+          <w:rFonts w:ascii="Arial" w:hAnsi="Arial"/>
+          <w:sz w:val="22"/>
+          <w:szCs w:val="22"/>
+          <w:i/>
+        </w:rPr>
+        <w:t xml:space="preserve">MIS Quarterly</w:t>
+      </w:r>
+      <w:r>
+        <w:rPr>
+          <w:rFonts w:ascii="Arial" w:hAnsi="Arial"/>
+          <w:sz w:val="22"/>
+          <w:szCs w:val="22"/>
+        </w:rPr>
+        <w:t xml:space="preserve">, 13(3), 319-340.</w:t>
+      </w:r>
+    </w:p>
+    <w:p>
+      <w:pPr>
+        <w:spacing w:before="60" w:after="60"/>
+        <w:ind w:left="360" w:hanging="180"/>
+      </w:pPr>
+      <w:r>
+        <w:rPr>
+          <w:rFonts w:ascii="Arial" w:hAnsi="Arial"/>
+          <w:b/>
+          <w:sz w:val="22"/>
+        </w:rPr>
+        <w:t>22. </w:t>
+      </w:r>
+      <w:r>
+        <w:rPr>
+          <w:rFonts w:ascii="Arial" w:hAnsi="Arial"/>
+          <w:sz w:val="22"/>
+          <w:szCs w:val="22"/>
+          <w:b/>
+        </w:rPr>
+        <w:t xml:space="preserve">ISO 9241-11. (2018)</w:t>
+      </w:r>
+      <w:r>
+        <w:rPr>
+          <w:rFonts w:ascii="Arial" w:hAnsi="Arial"/>
+          <w:sz w:val="22"/>
+          <w:szCs w:val="22"/>
+        </w:rPr>
+        <w:t xml:space="preserve">. </w:t>
+      </w:r>
+      <w:r>
+        <w:rPr>
+          <w:rFonts w:ascii="Arial" w:hAnsi="Arial"/>
+          <w:sz w:val="22"/>
+          <w:szCs w:val="22"/>
+          <w:i/>
+        </w:rPr>
+        <w:t xml:space="preserve">Ergonomics of human-system interaction — Part 11: Usability: Definitions and concepts</w:t>
+      </w:r>
+      <w:r>
+        <w:rPr>
+          <w:rFonts w:ascii="Arial" w:hAnsi="Arial"/>
+          <w:sz w:val="22"/>
+          <w:szCs w:val="22"/>
+        </w:rPr>
+        <w:t xml:space="preserve">. Geneva: International Organization for Standardization.</w:t>
+      </w:r>
+    </w:p>
+    <w:p>
+      <w:pPr>
+        <w:spacing w:before="60" w:after="60"/>
+        <w:ind w:left="360" w:hanging="180"/>
+      </w:pPr>
+      <w:r>
+        <w:rPr>
+          <w:rFonts w:ascii="Arial" w:hAnsi="Arial"/>
+          <w:b/>
+          <w:sz w:val="22"/>
+        </w:rPr>
+        <w:t>23. </w:t>
+      </w:r>
+      <w:r>
+        <w:rPr>
+          <w:rFonts w:ascii="Arial" w:hAnsi="Arial"/>
+          <w:sz w:val="22"/>
+          <w:szCs w:val="22"/>
+          <w:b/>
+        </w:rPr>
+        <w:t xml:space="preserve">Miles, M. B., Huberman, A. M., &amp; Saldaña, J. (2014)</w:t>
+      </w:r>
+      <w:r>
+        <w:rPr>
+          <w:rFonts w:ascii="Arial" w:hAnsi="Arial"/>
+          <w:sz w:val="22"/>
+          <w:szCs w:val="22"/>
+        </w:rPr>
+        <w:t xml:space="preserve">. </w:t>
+      </w:r>
+      <w:r>
+        <w:rPr>
+          <w:rFonts w:ascii="Arial" w:hAnsi="Arial"/>
+          <w:sz w:val="22"/>
+          <w:szCs w:val="22"/>
+          <w:i/>
+        </w:rPr>
+        <w:t xml:space="preserve">Qualitative Data Analysis: A Methods Sourcebook</w:t>
+      </w:r>
+      <w:r>
+        <w:rPr>
+          <w:rFonts w:ascii="Arial" w:hAnsi="Arial"/>
+          <w:sz w:val="22"/>
+          <w:szCs w:val="22"/>
+        </w:rPr>
+        <w:t xml:space="preserve"> (3rd ed.). Thousand Oaks, CA: Sage Publications.</w:t>
+      </w:r>
+    </w:p>
+    <w:p>
+      <w:pPr>
+        <w:spacing w:before="60" w:after="60"/>
+        <w:ind w:left="360" w:hanging="180"/>
+      </w:pPr>
+      <w:r>
+        <w:rPr>
+          <w:rFonts w:ascii="Arial" w:hAnsi="Arial"/>
+          <w:b/>
+          <w:sz w:val="22"/>
+        </w:rPr>
+        <w:t>24. </w:t>
+      </w:r>
+      <w:r>
+        <w:rPr>
+          <w:rFonts w:ascii="Arial" w:hAnsi="Arial"/>
+          <w:sz w:val="22"/>
+          <w:szCs w:val="22"/>
+          <w:b/>
+        </w:rPr>
+        <w:t xml:space="preserve">Nielsen, J. (1993)</w:t>
+      </w:r>
+      <w:r>
+        <w:rPr>
+          <w:rFonts w:ascii="Arial" w:hAnsi="Arial"/>
+          <w:sz w:val="22"/>
+          <w:szCs w:val="22"/>
+        </w:rPr>
+        <w:t xml:space="preserve">. </w:t>
+      </w:r>
+      <w:r>
+        <w:rPr>
+          <w:rFonts w:ascii="Arial" w:hAnsi="Arial"/>
+          <w:sz w:val="22"/>
+          <w:szCs w:val="22"/>
+          <w:i/>
+        </w:rPr>
+        <w:t xml:space="preserve">Usability Engineering</w:t>
+      </w:r>
+      <w:r>
+        <w:rPr>
+          <w:rFonts w:ascii="Arial" w:hAnsi="Arial"/>
+          <w:sz w:val="22"/>
+          <w:szCs w:val="22"/>
+        </w:rPr>
+        <w:t xml:space="preserve">. Boston: Academic Press.</w:t>
+      </w:r>
+    </w:p>
+    <w:p>
+      <w:pPr>
+        <w:spacing w:before="60" w:after="60"/>
+        <w:ind w:left="360" w:hanging="180"/>
+      </w:pPr>
+      <w:r>
+        <w:rPr>
+          <w:rFonts w:ascii="Arial" w:hAnsi="Arial"/>
+          <w:b/>
+          <w:sz w:val="22"/>
+        </w:rPr>
+        <w:t>25. </w:t>
+      </w:r>
+      <w:r>
+        <w:rPr>
+          <w:rFonts w:ascii="Arial" w:hAnsi="Arial"/>
+          <w:sz w:val="22"/>
+          <w:szCs w:val="22"/>
+          <w:b/>
+        </w:rPr>
+        <w:t xml:space="preserve">Peraturan Komisi Informasi Nomor 1 Tahun 2021</w:t>
+      </w:r>
+      <w:r>
+        <w:rPr>
+          <w:rFonts w:ascii="Arial" w:hAnsi="Arial"/>
+          <w:sz w:val="22"/>
+          <w:szCs w:val="22"/>
+        </w:rPr>
+        <w:t xml:space="preserve"> tentang Standar Layanan Informasi Publik.</w:t>
+      </w:r>
+    </w:p>
+    <w:p>
+      <w:pPr>
+        <w:spacing w:before="60" w:after="60"/>
+        <w:ind w:left="360" w:hanging="180"/>
+      </w:pPr>
+      <w:r>
+        <w:rPr>
+          <w:rFonts w:ascii="Arial" w:hAnsi="Arial"/>
+          <w:b/>
+          <w:sz w:val="22"/>
+        </w:rPr>
+        <w:t>26. </w:t>
+      </w:r>
+      <w:r>
+        <w:rPr>
+          <w:rFonts w:ascii="Arial" w:hAnsi="Arial"/>
+          <w:sz w:val="22"/>
+          <w:szCs w:val="22"/>
+          <w:b/>
+        </w:rPr>
+        <w:t xml:space="preserve">Pratama, I. P. A. (2014)</w:t>
+      </w:r>
+      <w:r>
+        <w:rPr>
+          <w:rFonts w:ascii="Arial" w:hAnsi="Arial"/>
+          <w:sz w:val="22"/>
+          <w:szCs w:val="22"/>
+        </w:rPr>
+        <w:t xml:space="preserve">. </w:t>
+      </w:r>
+      <w:r>
+        <w:rPr>
+          <w:rFonts w:ascii="Arial" w:hAnsi="Arial"/>
+          <w:sz w:val="22"/>
+          <w:szCs w:val="22"/>
+          <w:i/>
+        </w:rPr>
+        <w:t xml:space="preserve">Handbook E-Government</w:t>
+      </w:r>
+      <w:r>
+        <w:rPr>
+          <w:rFonts w:ascii="Arial" w:hAnsi="Arial"/>
+          <w:sz w:val="22"/>
+          <w:szCs w:val="22"/>
+        </w:rPr>
+        <w:t xml:space="preserve">. Bandung: Informatika.</w:t>
+      </w:r>
+    </w:p>
+    <w:p>
+      <w:pPr>
+        <w:spacing w:before="60" w:after="60"/>
+        <w:ind w:left="360" w:hanging="180"/>
+      </w:pPr>
+      <w:r>
+        <w:rPr>
+          <w:rFonts w:ascii="Arial" w:hAnsi="Arial"/>
+          <w:b/>
+          <w:sz w:val="22"/>
+        </w:rPr>
+        <w:t>27. </w:t>
+      </w:r>
+      <w:r>
+        <w:rPr>
+          <w:rFonts w:ascii="Arial" w:hAnsi="Arial"/>
+          <w:sz w:val="22"/>
+          <w:szCs w:val="22"/>
+          <w:b/>
+        </w:rPr>
+        <w:t xml:space="preserve">Sadewa, M. Y., Sujaya, M. A. P., Gunawan, I M. A. O., &amp; Indrawan, G. (2024)</w:t>
+      </w:r>
+      <w:r>
+        <w:rPr>
+          <w:rFonts w:ascii="Arial" w:hAnsi="Arial"/>
+          <w:sz w:val="22"/>
+          <w:szCs w:val="22"/>
+        </w:rPr>
+        <w:t xml:space="preserve">. Evaluasi Pengalaman Pengguna Website PPID Undiksha Dengan Metode User Experience Questionnaire (UEQ). </w:t>
+      </w:r>
+      <w:r>
+        <w:rPr>
+          <w:rFonts w:ascii="Arial" w:hAnsi="Arial"/>
+          <w:sz w:val="22"/>
+          <w:szCs w:val="22"/>
+          <w:i/>
+        </w:rPr>
+        <w:t xml:space="preserve">INSERT: Information System and Emerging Technology Journal</w:t>
+      </w:r>
+      <w:r>
+        <w:rPr>
+          <w:rFonts w:ascii="Arial" w:hAnsi="Arial"/>
+          <w:sz w:val="22"/>
+          <w:szCs w:val="22"/>
+        </w:rPr>
+        <w:t xml:space="preserve">, 5(1), 12-21. DOI: https://doi.org/10.23887/insert.v5i1.70383.</w:t>
+      </w:r>
+    </w:p>
+    <w:p>
+      <w:pPr>
+        <w:spacing w:before="60" w:after="60"/>
+        <w:ind w:left="360" w:hanging="180"/>
+      </w:pPr>
+      <w:r>
+        <w:rPr>
+          <w:rFonts w:ascii="Arial" w:hAnsi="Arial"/>
+          <w:b/>
+          <w:sz w:val="22"/>
+        </w:rPr>
+        <w:t>28. </w:t>
+      </w:r>
+      <w:r>
+        <w:rPr>
+          <w:rFonts w:ascii="Arial" w:hAnsi="Arial"/>
+          <w:sz w:val="22"/>
+          <w:szCs w:val="22"/>
+          <w:b/>
+        </w:rPr>
+        <w:t xml:space="preserve">Undang-Undang Republik Indonesia Nomor 14 Tahun 2008</w:t>
+      </w:r>
+      <w:r>
+        <w:rPr>
+          <w:rFonts w:ascii="Arial" w:hAnsi="Arial"/>
+          <w:sz w:val="22"/>
+          <w:szCs w:val="22"/>
+        </w:rPr>
+        <w:t xml:space="preserve"> tentang Keterbukaan Informasi Publik.</w:t>
       </w:r>
     </w:p>
     <w:sectPr>

</xml_diff>